<commit_message>
Added ID Format and corrected Alignment
</commit_message>
<xml_diff>
--- a/templates/Criminal_and_Civil_report_format.docx
+++ b/templates/Criminal_and_Civil_report_format.docx
@@ -166,17 +166,11 @@
               <w:tabs>
                 <w:tab w:val="left" w:pos="804"/>
               </w:tabs>
-              <w:ind w:left="118"/>
-              <w:rPr>
-                <w:sz w:val="20"/>
-              </w:rPr>
-            </w:pPr>
-            <w:r>
-              <w:rPr>
-                <w:sz w:val="20"/>
-              </w:rPr>
-              <w:t xml:space="preserve"> </w:t>
-            </w:r>
+              <w:ind w:left="163"/>
+              <w:rPr>
+                <w:sz w:val="20"/>
+              </w:rPr>
+            </w:pPr>
             <w:r>
               <w:rPr>
                 <w:sz w:val="20"/>
@@ -236,7 +230,21 @@
         <w:rPr>
           <w:sz w:val="20"/>
         </w:rPr>
-        <w:t xml:space="preserve">access to proprietary databases, as well as international criminal watchlists, sanctions lists, and politically exposed persons </w:t>
+        <w:t xml:space="preserve">access to proprietary databases, as well as international criminal watchlists, sanctions </w:t>
+      </w:r>
+      <w:proofErr w:type="gramStart"/>
+      <w:r>
+        <w:rPr>
+          <w:sz w:val="20"/>
+        </w:rPr>
+        <w:t>lists</w:t>
+      </w:r>
+      <w:proofErr w:type="gramEnd"/>
+      <w:r>
+        <w:rPr>
+          <w:sz w:val="20"/>
+        </w:rPr>
+        <w:t xml:space="preserve">, and politically exposed persons </w:t>
       </w:r>
     </w:p>
     <w:p>
@@ -416,16 +424,11 @@
           </w:tcPr>
           <w:p>
             <w:pPr>
-              <w:rPr>
-                <w:sz w:val="20"/>
-              </w:rPr>
-            </w:pPr>
-            <w:r>
-              <w:rPr>
-                <w:sz w:val="20"/>
-              </w:rPr>
-              <w:t xml:space="preserve">  </w:t>
-            </w:r>
+              <w:ind w:left="163"/>
+              <w:rPr>
+                <w:sz w:val="20"/>
+              </w:rPr>
+            </w:pPr>
             <w:r>
               <w:rPr>
                 <w:sz w:val="20"/>
@@ -486,16 +489,11 @@
           </w:tcPr>
           <w:p>
             <w:pPr>
-              <w:rPr>
-                <w:sz w:val="20"/>
-              </w:rPr>
-            </w:pPr>
-            <w:r>
-              <w:rPr>
-                <w:sz w:val="20"/>
-              </w:rPr>
-              <w:t xml:space="preserve">  </w:t>
-            </w:r>
+              <w:ind w:left="163"/>
+              <w:rPr>
+                <w:sz w:val="20"/>
+              </w:rPr>
+            </w:pPr>
             <w:r>
               <w:rPr>
                 <w:sz w:val="20"/>
@@ -545,7 +543,7 @@
           <w:p>
             <w:pPr>
               <w:pStyle w:val="TableParagraph"/>
-              <w:ind w:left="118"/>
+              <w:ind w:left="163"/>
               <w:rPr>
                 <w:sz w:val="20"/>
               </w:rPr>
@@ -598,16 +596,11 @@
           </w:tcPr>
           <w:p>
             <w:pPr>
-              <w:rPr>
-                <w:sz w:val="20"/>
-              </w:rPr>
-            </w:pPr>
-            <w:r>
-              <w:rPr>
-                <w:sz w:val="20"/>
-              </w:rPr>
-              <w:t xml:space="preserve">  </w:t>
-            </w:r>
+              <w:ind w:left="163"/>
+              <w:rPr>
+                <w:sz w:val="20"/>
+              </w:rPr>
+            </w:pPr>
             <w:r>
               <w:rPr>
                 <w:sz w:val="20"/>
@@ -656,16 +649,11 @@
           </w:tcPr>
           <w:p>
             <w:pPr>
-              <w:rPr>
-                <w:sz w:val="20"/>
-              </w:rPr>
-            </w:pPr>
-            <w:r>
-              <w:rPr>
-                <w:sz w:val="20"/>
-              </w:rPr>
-              <w:t xml:space="preserve">  </w:t>
-            </w:r>
+              <w:ind w:left="163"/>
+              <w:rPr>
+                <w:sz w:val="20"/>
+              </w:rPr>
+            </w:pPr>
             <w:r>
               <w:rPr>
                 <w:sz w:val="20"/>
@@ -710,7 +698,7 @@
             <w:pPr>
               <w:pStyle w:val="TableParagraph"/>
               <w:spacing w:before="0" w:line="244" w:lineRule="exact"/>
-              <w:ind w:left="118"/>
+              <w:ind w:left="163"/>
               <w:rPr>
                 <w:b/>
                 <w:bCs/>
@@ -762,7 +750,7 @@
             <w:pPr>
               <w:pStyle w:val="TableParagraph"/>
               <w:spacing w:before="0" w:line="244" w:lineRule="exact"/>
-              <w:ind w:left="118"/>
+              <w:ind w:left="163"/>
               <w:rPr>
                 <w:sz w:val="20"/>
               </w:rPr>
@@ -907,7 +895,7 @@
           <w:p>
             <w:pPr>
               <w:pStyle w:val="TableParagraph"/>
-              <w:ind w:left="118"/>
+              <w:ind w:left="163"/>
               <w:rPr>
                 <w:sz w:val="20"/>
               </w:rPr>
@@ -968,7 +956,7 @@
           <w:p>
             <w:pPr>
               <w:pStyle w:val="TableParagraph"/>
-              <w:ind w:left="118"/>
+              <w:ind w:left="163"/>
               <w:rPr>
                 <w:sz w:val="20"/>
               </w:rPr>
@@ -1015,7 +1003,7 @@
           <w:p>
             <w:pPr>
               <w:pStyle w:val="TableParagraph"/>
-              <w:ind w:left="118"/>
+              <w:ind w:left="163"/>
               <w:rPr>
                 <w:sz w:val="20"/>
               </w:rPr>
@@ -1069,7 +1057,7 @@
           <w:p>
             <w:pPr>
               <w:pStyle w:val="TableParagraph"/>
-              <w:ind w:left="118"/>
+              <w:ind w:left="163"/>
               <w:rPr>
                 <w:sz w:val="20"/>
               </w:rPr>
@@ -1123,7 +1111,7 @@
           <w:p>
             <w:pPr>
               <w:pStyle w:val="TableParagraph"/>
-              <w:ind w:left="118"/>
+              <w:ind w:left="163"/>
               <w:rPr>
                 <w:sz w:val="20"/>
               </w:rPr>

</xml_diff>